<commit_message>
Inital excel setup with Anantha done
</commit_message>
<xml_diff>
--- a/2025/NextGenIplRules2025.docx
+++ b/2025/NextGenIplRules2025.docx
@@ -1,6 +1,6 @@
 
 <file path=word/document.xml><?xml version="1.0" encoding="utf-8"?>
-<w:document xmlns:wpc="http://schemas.microsoft.com/office/word/2010/wordprocessingCanvas" xmlns:cx="http://schemas.microsoft.com/office/drawing/2014/chartex" xmlns:cx1="http://schemas.microsoft.com/office/drawing/2015/9/8/chartex" xmlns:cx2="http://schemas.microsoft.com/office/drawing/2015/10/21/chartex" xmlns:cx3="http://schemas.microsoft.com/office/drawing/2016/5/9/chartex" xmlns:cx4="http://schemas.microsoft.com/office/drawing/2016/5/10/chartex" xmlns:cx5="http://schemas.microsoft.com/office/drawing/2016/5/11/chartex" xmlns:cx6="http://schemas.microsoft.com/office/drawing/2016/5/12/chartex" xmlns:cx7="http://schemas.microsoft.com/office/drawing/2016/5/13/chartex" xmlns:cx8="http://schemas.microsoft.com/office/drawing/2016/5/14/chartex" xmlns:mc="http://schemas.openxmlformats.org/markup-compatibility/2006" xmlns:aink="http://schemas.microsoft.com/office/drawing/2016/ink" xmlns:am3d="http://schemas.microsoft.com/office/drawing/2017/model3d" xmlns:o="urn:schemas-microsoft-com:office:office" xmlns:oel="http://schemas.microsoft.com/office/2019/extlst" xmlns:r="http://schemas.openxmlformats.org/officeDocument/2006/relationships" xmlns:m="http://schemas.openxmlformats.org/officeDocument/2006/math" xmlns:v="urn:schemas-microsoft-com:vml" xmlns:wp14="http://schemas.microsoft.com/office/word/2010/wordprocessingDrawing" xmlns:wp="http://schemas.openxmlformats.org/drawingml/2006/wordprocessingDrawing" xmlns:w10="urn:schemas-microsoft-com:office:word" xmlns:w="http://schemas.openxmlformats.org/wordprocessingml/2006/main" xmlns:w14="http://schemas.microsoft.com/office/word/2010/wordml" xmlns:w15="http://schemas.microsoft.com/office/word/2012/wordml" xmlns:w16cex="http://schemas.microsoft.com/office/word/2018/wordml/cex" xmlns:w16cid="http://schemas.microsoft.com/office/word/2016/wordml/cid" xmlns:w16="http://schemas.microsoft.com/office/word/2018/wordml" xmlns:w16sdtdh="http://schemas.microsoft.com/office/word/2020/wordml/sdtdatahash" xmlns:w16se="http://schemas.microsoft.com/office/word/2015/wordml/symex" xmlns:wpg="http://schemas.microsoft.com/office/word/2010/wordprocessingGroup" xmlns:wpi="http://schemas.microsoft.com/office/word/2010/wordprocessingInk" xmlns:wne="http://schemas.microsoft.com/office/word/2006/wordml" xmlns:wps="http://schemas.microsoft.com/office/word/2010/wordprocessingShape" mc:Ignorable="w14 w15 w16se w16cid w16 w16cex w16sdtdh wp14">
+<w:document xmlns:wpc="http://schemas.microsoft.com/office/word/2010/wordprocessingCanvas" xmlns:cx="http://schemas.microsoft.com/office/drawing/2014/chartex" xmlns:cx1="http://schemas.microsoft.com/office/drawing/2015/9/8/chartex" xmlns:cx2="http://schemas.microsoft.com/office/drawing/2015/10/21/chartex" xmlns:cx3="http://schemas.microsoft.com/office/drawing/2016/5/9/chartex" xmlns:cx4="http://schemas.microsoft.com/office/drawing/2016/5/10/chartex" xmlns:cx5="http://schemas.microsoft.com/office/drawing/2016/5/11/chartex" xmlns:cx6="http://schemas.microsoft.com/office/drawing/2016/5/12/chartex" xmlns:cx7="http://schemas.microsoft.com/office/drawing/2016/5/13/chartex" xmlns:cx8="http://schemas.microsoft.com/office/drawing/2016/5/14/chartex" xmlns:mc="http://schemas.openxmlformats.org/markup-compatibility/2006" xmlns:aink="http://schemas.microsoft.com/office/drawing/2016/ink" xmlns:am3d="http://schemas.microsoft.com/office/drawing/2017/model3d" xmlns:o="urn:schemas-microsoft-com:office:office" xmlns:oel="http://schemas.microsoft.com/office/2019/extlst" xmlns:r="http://schemas.openxmlformats.org/officeDocument/2006/relationships" xmlns:m="http://schemas.openxmlformats.org/officeDocument/2006/math" xmlns:v="urn:schemas-microsoft-com:vml" xmlns:wp14="http://schemas.microsoft.com/office/word/2010/wordprocessingDrawing" xmlns:wp="http://schemas.openxmlformats.org/drawingml/2006/wordprocessingDrawing" xmlns:w10="urn:schemas-microsoft-com:office:word" xmlns:w="http://schemas.openxmlformats.org/wordprocessingml/2006/main" xmlns:w14="http://schemas.microsoft.com/office/word/2010/wordml" xmlns:w15="http://schemas.microsoft.com/office/word/2012/wordml" xmlns:w16cex="http://schemas.microsoft.com/office/word/2018/wordml/cex" xmlns:w16cid="http://schemas.microsoft.com/office/word/2016/wordml/cid" xmlns:w16="http://schemas.microsoft.com/office/word/2018/wordml" xmlns:w16du="http://schemas.microsoft.com/office/word/2023/wordml/word16du" xmlns:w16sdtdh="http://schemas.microsoft.com/office/word/2020/wordml/sdtdatahash" xmlns:w16sdtfl="http://schemas.microsoft.com/office/word/2024/wordml/sdtformatlock" xmlns:w16se="http://schemas.microsoft.com/office/word/2015/wordml/symex" xmlns:wpg="http://schemas.microsoft.com/office/word/2010/wordprocessingGroup" xmlns:wpi="http://schemas.microsoft.com/office/word/2010/wordprocessingInk" xmlns:wne="http://schemas.microsoft.com/office/word/2006/wordml" xmlns:wps="http://schemas.microsoft.com/office/word/2010/wordprocessingShape" mc:Ignorable="w14 w15 w16se w16cid w16 w16cex w16sdtdh w16sdtfl w16du wp14">
   <w:body>
     <w:p>
       <w:pPr>
@@ -27,7 +27,7 @@
           <w:u w:val="single"/>
           <w:lang w:val="en-US"/>
         </w:rPr>
-        <w:t>4</w:t>
+        <w:t>5</w:t>
       </w:r>
       <w:r>
         <w:rPr>
@@ -72,28 +72,14 @@
         <w:rPr>
           <w:lang w:val="en-US"/>
         </w:rPr>
-        <w:t>Download the Dream 11 app from this link</w:t>
-      </w:r>
-      <w:r>
-        <w:rPr>
-          <w:lang w:val="en-US"/>
-        </w:rPr>
-        <w:t xml:space="preserve"> (iOS figure out on own)</w:t>
-      </w:r>
-      <w:r>
-        <w:rPr>
-          <w:lang w:val="en-US"/>
-        </w:rPr>
-        <w:t xml:space="preserve">: </w:t>
-      </w:r>
-      <w:hyperlink r:id="rId5" w:history="1">
-        <w:r>
-          <w:rPr>
-            <w:rStyle w:val="Hyperlink"/>
-          </w:rPr>
-          <w:t>https://www.dream11.com/dream11.apk</w:t>
-        </w:r>
-      </w:hyperlink>
+        <w:t>Download the Dream 11 app f</w:t>
+      </w:r>
+      <w:r>
+        <w:rPr>
+          <w:lang w:val="en-US"/>
+        </w:rPr>
+        <w:t>or respective platforms</w:t>
+      </w:r>
     </w:p>
     <w:p>
       <w:pPr>
@@ -284,7 +270,43 @@
         <w:rPr>
           <w:lang w:val="en-US"/>
         </w:rPr>
-        <w:t>day at 1:30 p.m. IST.</w:t>
+        <w:t xml:space="preserve">day at </w:t>
+      </w:r>
+      <w:r>
+        <w:rPr>
+          <w:lang w:val="en-US"/>
+        </w:rPr>
+        <w:t>1</w:t>
+      </w:r>
+      <w:r>
+        <w:rPr>
+          <w:lang w:val="en-US"/>
+        </w:rPr>
+        <w:t>1:</w:t>
+      </w:r>
+      <w:r>
+        <w:rPr>
+          <w:lang w:val="en-US"/>
+        </w:rPr>
+        <w:t>00</w:t>
+      </w:r>
+      <w:r>
+        <w:rPr>
+          <w:lang w:val="en-US"/>
+        </w:rPr>
+        <w:t xml:space="preserve"> </w:t>
+      </w:r>
+      <w:r>
+        <w:rPr>
+          <w:lang w:val="en-US"/>
+        </w:rPr>
+        <w:t>a</w:t>
+      </w:r>
+      <w:r>
+        <w:rPr>
+          <w:lang w:val="en-US"/>
+        </w:rPr>
+        <w:t>.m. IST.</w:t>
       </w:r>
     </w:p>
     <w:p>
@@ -340,20 +362,21 @@
     <w:tbl>
       <w:tblPr>
         <w:tblStyle w:val="TableGrid"/>
-        <w:tblW w:w="0" w:type="auto"/>
+        <w:tblW w:w="8290" w:type="dxa"/>
         <w:tblInd w:w="720" w:type="dxa"/>
         <w:tblLook w:val="04A0" w:firstRow="1" w:lastRow="0" w:firstColumn="1" w:lastColumn="0" w:noHBand="0" w:noVBand="1"/>
       </w:tblPr>
       <w:tblGrid>
-        <w:gridCol w:w="1386"/>
-        <w:gridCol w:w="977"/>
-        <w:gridCol w:w="816"/>
-        <w:gridCol w:w="770"/>
-        <w:gridCol w:w="770"/>
-        <w:gridCol w:w="770"/>
-        <w:gridCol w:w="770"/>
-        <w:gridCol w:w="677"/>
-        <w:gridCol w:w="677"/>
+        <w:gridCol w:w="1385"/>
+        <w:gridCol w:w="964"/>
+        <w:gridCol w:w="809"/>
+        <w:gridCol w:w="757"/>
+        <w:gridCol w:w="756"/>
+        <w:gridCol w:w="757"/>
+        <w:gridCol w:w="761"/>
+        <w:gridCol w:w="761"/>
+        <w:gridCol w:w="670"/>
+        <w:gridCol w:w="670"/>
       </w:tblGrid>
       <w:tr>
         <w:trPr>
@@ -361,7 +384,7 @@
         </w:trPr>
         <w:tc>
           <w:tcPr>
-            <w:tcW w:w="1386" w:type="dxa"/>
+            <w:tcW w:w="1385" w:type="dxa"/>
             <w:vAlign w:val="center"/>
           </w:tcPr>
           <w:p>
@@ -387,7 +410,7 @@
         </w:tc>
         <w:tc>
           <w:tcPr>
-            <w:tcW w:w="977" w:type="dxa"/>
+            <w:tcW w:w="964" w:type="dxa"/>
             <w:shd w:val="clear" w:color="auto" w:fill="FFD966" w:themeFill="accent4" w:themeFillTint="99"/>
             <w:vAlign w:val="center"/>
           </w:tcPr>
@@ -414,7 +437,7 @@
         </w:tc>
         <w:tc>
           <w:tcPr>
-            <w:tcW w:w="816" w:type="dxa"/>
+            <w:tcW w:w="809" w:type="dxa"/>
             <w:shd w:val="clear" w:color="auto" w:fill="FFD966" w:themeFill="accent4" w:themeFillTint="99"/>
             <w:vAlign w:val="center"/>
           </w:tcPr>
@@ -441,7 +464,7 @@
         </w:tc>
         <w:tc>
           <w:tcPr>
-            <w:tcW w:w="770" w:type="dxa"/>
+            <w:tcW w:w="757" w:type="dxa"/>
             <w:shd w:val="clear" w:color="auto" w:fill="FFD966" w:themeFill="accent4" w:themeFillTint="99"/>
             <w:vAlign w:val="center"/>
           </w:tcPr>
@@ -470,7 +493,7 @@
         </w:tc>
         <w:tc>
           <w:tcPr>
-            <w:tcW w:w="770" w:type="dxa"/>
+            <w:tcW w:w="756" w:type="dxa"/>
             <w:shd w:val="clear" w:color="auto" w:fill="FFD966" w:themeFill="accent4" w:themeFillTint="99"/>
             <w:vAlign w:val="center"/>
           </w:tcPr>
@@ -497,7 +520,7 @@
         </w:tc>
         <w:tc>
           <w:tcPr>
-            <w:tcW w:w="770" w:type="dxa"/>
+            <w:tcW w:w="757" w:type="dxa"/>
             <w:shd w:val="clear" w:color="auto" w:fill="FFD966" w:themeFill="accent4" w:themeFillTint="99"/>
             <w:vAlign w:val="center"/>
           </w:tcPr>
@@ -524,7 +547,7 @@
         </w:tc>
         <w:tc>
           <w:tcPr>
-            <w:tcW w:w="770" w:type="dxa"/>
+            <w:tcW w:w="761" w:type="dxa"/>
             <w:shd w:val="clear" w:color="auto" w:fill="FFD966" w:themeFill="accent4" w:themeFillTint="99"/>
             <w:vAlign w:val="center"/>
           </w:tcPr>
@@ -551,7 +574,7 @@
         </w:tc>
         <w:tc>
           <w:tcPr>
-            <w:tcW w:w="677" w:type="dxa"/>
+            <w:tcW w:w="761" w:type="dxa"/>
             <w:shd w:val="clear" w:color="auto" w:fill="FFD966" w:themeFill="accent4" w:themeFillTint="99"/>
             <w:vAlign w:val="center"/>
           </w:tcPr>
@@ -578,7 +601,7 @@
         </w:tc>
         <w:tc>
           <w:tcPr>
-            <w:tcW w:w="677" w:type="dxa"/>
+            <w:tcW w:w="670" w:type="dxa"/>
             <w:shd w:val="clear" w:color="auto" w:fill="FFD966" w:themeFill="accent4" w:themeFillTint="99"/>
             <w:vAlign w:val="center"/>
           </w:tcPr>
@@ -600,6 +623,33 @@
                 <w:lang w:val="en-US"/>
               </w:rPr>
               <w:t>8</w:t>
+            </w:r>
+          </w:p>
+        </w:tc>
+        <w:tc>
+          <w:tcPr>
+            <w:tcW w:w="670" w:type="dxa"/>
+            <w:shd w:val="clear" w:color="auto" w:fill="FFD966" w:themeFill="accent4" w:themeFillTint="99"/>
+            <w:vAlign w:val="center"/>
+          </w:tcPr>
+          <w:p>
+            <w:pPr>
+              <w:pStyle w:val="ListParagraph"/>
+              <w:ind w:left="0"/>
+              <w:jc w:val="center"/>
+              <w:rPr>
+                <w:b/>
+                <w:bCs/>
+                <w:lang w:val="en-US"/>
+              </w:rPr>
+            </w:pPr>
+            <w:r>
+              <w:rPr>
+                <w:b/>
+                <w:bCs/>
+                <w:lang w:val="en-US"/>
+              </w:rPr>
+              <w:t>9</w:t>
             </w:r>
           </w:p>
         </w:tc>
@@ -610,7 +660,7 @@
         </w:trPr>
         <w:tc>
           <w:tcPr>
-            <w:tcW w:w="1386" w:type="dxa"/>
+            <w:tcW w:w="1385" w:type="dxa"/>
             <w:vAlign w:val="center"/>
           </w:tcPr>
           <w:p>
@@ -656,7 +706,7 @@
         </w:tc>
         <w:tc>
           <w:tcPr>
-            <w:tcW w:w="977" w:type="dxa"/>
+            <w:tcW w:w="964" w:type="dxa"/>
             <w:shd w:val="clear" w:color="auto" w:fill="A8D08D" w:themeFill="accent6" w:themeFillTint="99"/>
             <w:vAlign w:val="center"/>
           </w:tcPr>
@@ -683,7 +733,7 @@
         </w:tc>
         <w:tc>
           <w:tcPr>
-            <w:tcW w:w="816" w:type="dxa"/>
+            <w:tcW w:w="809" w:type="dxa"/>
             <w:shd w:val="clear" w:color="auto" w:fill="C5E0B3" w:themeFill="accent6" w:themeFillTint="66"/>
             <w:vAlign w:val="center"/>
           </w:tcPr>
@@ -710,7 +760,7 @@
         </w:tc>
         <w:tc>
           <w:tcPr>
-            <w:tcW w:w="770" w:type="dxa"/>
+            <w:tcW w:w="757" w:type="dxa"/>
             <w:shd w:val="clear" w:color="auto" w:fill="E2EFD9" w:themeFill="accent6" w:themeFillTint="33"/>
             <w:vAlign w:val="center"/>
           </w:tcPr>
@@ -739,7 +789,7 @@
         </w:tc>
         <w:tc>
           <w:tcPr>
-            <w:tcW w:w="770" w:type="dxa"/>
+            <w:tcW w:w="756" w:type="dxa"/>
             <w:shd w:val="clear" w:color="auto" w:fill="DEEAF6" w:themeFill="accent5" w:themeFillTint="33"/>
             <w:vAlign w:val="center"/>
           </w:tcPr>
@@ -760,13 +810,40 @@
                 <w:bCs/>
                 <w:lang w:val="en-US"/>
               </w:rPr>
-              <w:t>-5</w:t>
+              <w:t>0</w:t>
             </w:r>
           </w:p>
         </w:tc>
         <w:tc>
           <w:tcPr>
-            <w:tcW w:w="770" w:type="dxa"/>
+            <w:tcW w:w="757" w:type="dxa"/>
+            <w:shd w:val="clear" w:color="auto" w:fill="F9C0AE"/>
+            <w:vAlign w:val="center"/>
+          </w:tcPr>
+          <w:p>
+            <w:pPr>
+              <w:pStyle w:val="ListParagraph"/>
+              <w:ind w:left="0"/>
+              <w:jc w:val="center"/>
+              <w:rPr>
+                <w:b/>
+                <w:bCs/>
+                <w:lang w:val="en-US"/>
+              </w:rPr>
+            </w:pPr>
+            <w:r>
+              <w:rPr>
+                <w:b/>
+                <w:bCs/>
+                <w:lang w:val="en-US"/>
+              </w:rPr>
+              <w:t>-5</w:t>
+            </w:r>
+          </w:p>
+        </w:tc>
+        <w:tc>
+          <w:tcPr>
+            <w:tcW w:w="761" w:type="dxa"/>
             <w:shd w:val="clear" w:color="auto" w:fill="F7AFBA"/>
             <w:vAlign w:val="center"/>
           </w:tcPr>
@@ -801,7 +878,7 @@
         </w:tc>
         <w:tc>
           <w:tcPr>
-            <w:tcW w:w="770" w:type="dxa"/>
+            <w:tcW w:w="761" w:type="dxa"/>
             <w:shd w:val="clear" w:color="auto" w:fill="FB7A8E"/>
             <w:vAlign w:val="center"/>
           </w:tcPr>
@@ -836,7 +913,7 @@
         </w:tc>
         <w:tc>
           <w:tcPr>
-            <w:tcW w:w="677" w:type="dxa"/>
+            <w:tcW w:w="670" w:type="dxa"/>
             <w:shd w:val="clear" w:color="auto" w:fill="FD5570"/>
             <w:vAlign w:val="center"/>
           </w:tcPr>
@@ -871,7 +948,7 @@
         </w:tc>
         <w:tc>
           <w:tcPr>
-            <w:tcW w:w="677" w:type="dxa"/>
+            <w:tcW w:w="670" w:type="dxa"/>
             <w:shd w:val="clear" w:color="auto" w:fill="FF0038"/>
             <w:vAlign w:val="center"/>
           </w:tcPr>
@@ -1111,7 +1188,7 @@
 </file>
 
 <file path=word/numbering.xml><?xml version="1.0" encoding="utf-8"?>
-<w:numbering xmlns:wpc="http://schemas.microsoft.com/office/word/2010/wordprocessingCanvas" xmlns:cx="http://schemas.microsoft.com/office/drawing/2014/chartex" xmlns:cx1="http://schemas.microsoft.com/office/drawing/2015/9/8/chartex" xmlns:cx2="http://schemas.microsoft.com/office/drawing/2015/10/21/chartex" xmlns:cx3="http://schemas.microsoft.com/office/drawing/2016/5/9/chartex" xmlns:cx4="http://schemas.microsoft.com/office/drawing/2016/5/10/chartex" xmlns:cx5="http://schemas.microsoft.com/office/drawing/2016/5/11/chartex" xmlns:cx6="http://schemas.microsoft.com/office/drawing/2016/5/12/chartex" xmlns:cx7="http://schemas.microsoft.com/office/drawing/2016/5/13/chartex" xmlns:cx8="http://schemas.microsoft.com/office/drawing/2016/5/14/chartex" xmlns:mc="http://schemas.openxmlformats.org/markup-compatibility/2006" xmlns:aink="http://schemas.microsoft.com/office/drawing/2016/ink" xmlns:am3d="http://schemas.microsoft.com/office/drawing/2017/model3d" xmlns:o="urn:schemas-microsoft-com:office:office" xmlns:oel="http://schemas.microsoft.com/office/2019/extlst" xmlns:r="http://schemas.openxmlformats.org/officeDocument/2006/relationships" xmlns:m="http://schemas.openxmlformats.org/officeDocument/2006/math" xmlns:v="urn:schemas-microsoft-com:vml" xmlns:wp14="http://schemas.microsoft.com/office/word/2010/wordprocessingDrawing" xmlns:wp="http://schemas.openxmlformats.org/drawingml/2006/wordprocessingDrawing" xmlns:w10="urn:schemas-microsoft-com:office:word" xmlns:w="http://schemas.openxmlformats.org/wordprocessingml/2006/main" xmlns:w14="http://schemas.microsoft.com/office/word/2010/wordml" xmlns:w15="http://schemas.microsoft.com/office/word/2012/wordml" xmlns:w16cex="http://schemas.microsoft.com/office/word/2018/wordml/cex" xmlns:w16cid="http://schemas.microsoft.com/office/word/2016/wordml/cid" xmlns:w16="http://schemas.microsoft.com/office/word/2018/wordml" xmlns:w16sdtdh="http://schemas.microsoft.com/office/word/2020/wordml/sdtdatahash" xmlns:w16se="http://schemas.microsoft.com/office/word/2015/wordml/symex" xmlns:wpg="http://schemas.microsoft.com/office/word/2010/wordprocessingGroup" xmlns:wpi="http://schemas.microsoft.com/office/word/2010/wordprocessingInk" xmlns:wne="http://schemas.microsoft.com/office/word/2006/wordml" xmlns:wps="http://schemas.microsoft.com/office/word/2010/wordprocessingShape" mc:Ignorable="w14 w15 w16se w16cid w16 w16cex w16sdtdh wp14">
+<w:numbering xmlns:wpc="http://schemas.microsoft.com/office/word/2010/wordprocessingCanvas" xmlns:cx="http://schemas.microsoft.com/office/drawing/2014/chartex" xmlns:cx1="http://schemas.microsoft.com/office/drawing/2015/9/8/chartex" xmlns:cx2="http://schemas.microsoft.com/office/drawing/2015/10/21/chartex" xmlns:cx3="http://schemas.microsoft.com/office/drawing/2016/5/9/chartex" xmlns:cx4="http://schemas.microsoft.com/office/drawing/2016/5/10/chartex" xmlns:cx5="http://schemas.microsoft.com/office/drawing/2016/5/11/chartex" xmlns:cx6="http://schemas.microsoft.com/office/drawing/2016/5/12/chartex" xmlns:cx7="http://schemas.microsoft.com/office/drawing/2016/5/13/chartex" xmlns:cx8="http://schemas.microsoft.com/office/drawing/2016/5/14/chartex" xmlns:mc="http://schemas.openxmlformats.org/markup-compatibility/2006" xmlns:aink="http://schemas.microsoft.com/office/drawing/2016/ink" xmlns:am3d="http://schemas.microsoft.com/office/drawing/2017/model3d" xmlns:o="urn:schemas-microsoft-com:office:office" xmlns:oel="http://schemas.microsoft.com/office/2019/extlst" xmlns:r="http://schemas.openxmlformats.org/officeDocument/2006/relationships" xmlns:m="http://schemas.openxmlformats.org/officeDocument/2006/math" xmlns:v="urn:schemas-microsoft-com:vml" xmlns:wp14="http://schemas.microsoft.com/office/word/2010/wordprocessingDrawing" xmlns:wp="http://schemas.openxmlformats.org/drawingml/2006/wordprocessingDrawing" xmlns:w10="urn:schemas-microsoft-com:office:word" xmlns:w="http://schemas.openxmlformats.org/wordprocessingml/2006/main" xmlns:w14="http://schemas.microsoft.com/office/word/2010/wordml" xmlns:w15="http://schemas.microsoft.com/office/word/2012/wordml" xmlns:w16cex="http://schemas.microsoft.com/office/word/2018/wordml/cex" xmlns:w16cid="http://schemas.microsoft.com/office/word/2016/wordml/cid" xmlns:w16="http://schemas.microsoft.com/office/word/2018/wordml" xmlns:w16du="http://schemas.microsoft.com/office/word/2023/wordml/word16du" xmlns:w16sdtdh="http://schemas.microsoft.com/office/word/2020/wordml/sdtdatahash" xmlns:w16sdtfl="http://schemas.microsoft.com/office/word/2024/wordml/sdtformatlock" xmlns:w16se="http://schemas.microsoft.com/office/word/2015/wordml/symex" xmlns:wpg="http://schemas.microsoft.com/office/word/2010/wordprocessingGroup" xmlns:wpi="http://schemas.microsoft.com/office/word/2010/wordprocessingInk" xmlns:wne="http://schemas.microsoft.com/office/word/2006/wordml" xmlns:wps="http://schemas.microsoft.com/office/word/2010/wordprocessingShape" mc:Ignorable="w14 w15 w16se w16cid w16 w16cex w16sdtdh w16sdtfl w16du wp14">
   <w:abstractNum w:abstractNumId="0" w15:restartNumberingAfterBreak="0">
     <w:nsid w:val="113C5C87"/>
     <w:multiLevelType w:val="hybridMultilevel"/>
@@ -1300,7 +1377,7 @@
 </file>
 
 <file path=word/styles.xml><?xml version="1.0" encoding="utf-8"?>
-<w:styles xmlns:mc="http://schemas.openxmlformats.org/markup-compatibility/2006" xmlns:r="http://schemas.openxmlformats.org/officeDocument/2006/relationships" xmlns:w="http://schemas.openxmlformats.org/wordprocessingml/2006/main" xmlns:w14="http://schemas.microsoft.com/office/word/2010/wordml" xmlns:w15="http://schemas.microsoft.com/office/word/2012/wordml" xmlns:w16cex="http://schemas.microsoft.com/office/word/2018/wordml/cex" xmlns:w16cid="http://schemas.microsoft.com/office/word/2016/wordml/cid" xmlns:w16="http://schemas.microsoft.com/office/word/2018/wordml" xmlns:w16sdtdh="http://schemas.microsoft.com/office/word/2020/wordml/sdtdatahash" xmlns:w16se="http://schemas.microsoft.com/office/word/2015/wordml/symex" mc:Ignorable="w14 w15 w16se w16cid w16 w16cex w16sdtdh">
+<w:styles xmlns:mc="http://schemas.openxmlformats.org/markup-compatibility/2006" xmlns:r="http://schemas.openxmlformats.org/officeDocument/2006/relationships" xmlns:w="http://schemas.openxmlformats.org/wordprocessingml/2006/main" xmlns:w14="http://schemas.microsoft.com/office/word/2010/wordml" xmlns:w15="http://schemas.microsoft.com/office/word/2012/wordml" xmlns:w16cex="http://schemas.microsoft.com/office/word/2018/wordml/cex" xmlns:w16cid="http://schemas.microsoft.com/office/word/2016/wordml/cid" xmlns:w16="http://schemas.microsoft.com/office/word/2018/wordml" xmlns:w16du="http://schemas.microsoft.com/office/word/2023/wordml/word16du" xmlns:w16sdtdh="http://schemas.microsoft.com/office/word/2020/wordml/sdtdatahash" xmlns:w16sdtfl="http://schemas.microsoft.com/office/word/2024/wordml/sdtformatlock" xmlns:w16se="http://schemas.microsoft.com/office/word/2015/wordml/symex" mc:Ignorable="w14 w15 w16se w16cid w16 w16cex w16sdtdh w16sdtfl w16du">
   <w:docDefaults>
     <w:rPrDefault>
       <w:rPr>

</xml_diff>